<commit_message>
feat(data_validation): add 6_weights.py to build the weighted graph edges
- Compute sw (platform -> platform) edge weights as round_half_up_mean of
  pooled travel-time samples from stop_times_shared.txt, written to
  subway_weights.txt (from_stop_id, to_stop_id, weight_seconds, line)
- Combine sw weights with tf (transfers_shared.txt min_transfer_time) and
  pw (pathways_shared.txt traversal_time, entrance<->platform only) edges
  into weights.txt (from_stop_id, to_stop_id, weight_seconds, type)
- Order both files by the canonical stop order of
  subway_route_names_stop_ids_artificial, entrances sorted last
- Add WEIGHTS_BASE/SUBWAY_WEIGHTS_FILE/WEIGHTS_FILE constants,
  build_stop_id_order_index, and load_transfer_weights to gtfs_utils.py
- Document the new step in README.md, processing/README.md, and
  WORKFLOW.md (step 12, motivated by directional_asymmetry.py and
  edge_weight_validation.py)
</commit_message>
<xml_diff>
--- a/.docu/Precisió.docx
+++ b/.docu/Precisió.docx
@@ -325,7 +325,6 @@
       <w:pPr>
         <w:rPr>
           <w:rFonts w:ascii="Arial" w:hAnsi="Arial" w:cs="Arial"/>
-          <w:lang w:val="ca-ES"/>
         </w:rPr>
       </w:pPr>
       <w:r>
@@ -348,6 +347,44 @@
           <w:rFonts w:ascii="Arial" w:hAnsi="Arial" w:cs="Arial"/>
         </w:rPr>
         <w:t xml:space="preserve">. </w:t>
+      </w:r>
+    </w:p>
+    <w:p>
+      <w:pPr>
+        <w:rPr>
+          <w:rFonts w:ascii="Arial" w:hAnsi="Arial" w:cs="Arial"/>
+          <w:lang w:val="ca-ES"/>
+        </w:rPr>
+      </w:pPr>
+      <w:r>
+        <w:rPr>
+          <w:rFonts w:ascii="Arial" w:hAnsi="Arial" w:cs="Arial"/>
+        </w:rPr>
+        <w:t>Aquesta funció és utilitzada tant a la creació de ‘doors.txt’ (a ‘</w:t>
+      </w:r>
+      <w:r>
+        <w:rPr>
+          <w:rFonts w:ascii="Arial" w:hAnsi="Arial" w:cs="Arial"/>
+        </w:rPr>
+        <w:t>data_validation/checks/stop_times/3_door_times_check.py</w:t>
+      </w:r>
+      <w:r>
+        <w:rPr>
+          <w:rFonts w:ascii="Arial" w:hAnsi="Arial" w:cs="Arial"/>
+        </w:rPr>
+        <w:t>’) com a la creació de ‘subway_weights.txt’ (a ‘</w:t>
+      </w:r>
+      <w:r>
+        <w:rPr>
+          <w:rFonts w:ascii="Arial" w:hAnsi="Arial" w:cs="Arial"/>
+        </w:rPr>
+        <w:t>data_validation/processing/6_weights.py</w:t>
+      </w:r>
+      <w:r>
+        <w:rPr>
+          <w:rFonts w:ascii="Arial" w:hAnsi="Arial" w:cs="Arial"/>
+        </w:rPr>
+        <w:t>’).</w:t>
       </w:r>
     </w:p>
     <w:p>

</xml_diff>